<commit_message>
Add 3-scenario multi-market model (Conservative/Base/Upside), comprehensive report, and investor PPTX deck
</commit_message>
<xml_diff>
--- a/synexo/Synapep_MultiMarket_Model.docx
+++ b/synexo/Synapep_MultiMarket_Model.docx
@@ -27,9 +27,9 @@
           <w:b w:val="0"/>
           <w:i w:val="0"/>
           <w:color w:val="555555"/>
-          <w:sz w:val="30"/>
+          <w:sz w:val="28"/>
         </w:rPr>
-        <w:t>Multi-Market Revenue Model</w:t>
+        <w:t>Multi-Market Revenue Model — Conservative / Base / Upside</w:t>
       </w:r>
     </w:p>
     <w:p>
@@ -70,76 +70,7 @@
           <w:i w:val="0"/>
           <w:sz w:val="21"/>
         </w:rPr>
-        <w:t>One product family — the applicator device + CodeLife-configured peptide/exosome kit developed for Korean physicians — is exported as-is. Personalisation is by physician purpose within the same approved envelope; there is no separate per-market product development. Unit economics are identical in every market; only the clinic base and timing differ.</w:t>
-      </w:r>
-    </w:p>
-    <w:p>
-      <w:pPr>
-        <w:spacing w:after="40"/>
-      </w:pPr>
-      <w:r>
-        <w:rPr>
-          <w:b/>
-          <w:i w:val="0"/>
-          <w:sz w:val="21"/>
-        </w:rPr>
-        <w:t>Why one product across markets matters</w:t>
-      </w:r>
-    </w:p>
-    <w:p>
-      <w:pPr>
-        <w:pStyle w:val="ListBullet"/>
-      </w:pPr>
-      <w:r>
-        <w:rPr>
-          <w:b/>
-        </w:rPr>
-        <w:t>Same unit economics everywhere —</w:t>
-      </w:r>
-      <w:r>
-        <w:t xml:space="preserve"> EXW $32.50, kit GP $21.50 (66.2%); device ASP $3000 at 40% GM.</w:t>
-      </w:r>
-    </w:p>
-    <w:p>
-      <w:pPr>
-        <w:pStyle w:val="ListBullet"/>
-      </w:pPr>
-      <w:r>
-        <w:rPr>
-          <w:b/>
-        </w:rPr>
-        <w:t>Manufacturing scale —</w:t>
-      </w:r>
-      <w:r>
-        <w:t xml:space="preserve"> one production line + one QC/stability spec serves all markets; scale lowers cost and focuses the cold-chain fix on a single SKU family.</w:t>
-      </w:r>
-    </w:p>
-    <w:p>
-      <w:pPr>
-        <w:pStyle w:val="ListBullet"/>
-      </w:pPr>
-      <w:r>
-        <w:rPr>
-          <w:b/>
-        </w:rPr>
-        <w:t>Richer data flywheel —</w:t>
-      </w:r>
-      <w:r>
-        <w:t xml:space="preserve"> the same product across 12 markets yields a larger, comparable outcomes dataset.</w:t>
-      </w:r>
-    </w:p>
-    <w:p>
-      <w:pPr>
-        <w:pStyle w:val="ListBullet"/>
-      </w:pPr>
-      <w:r>
-        <w:rPr>
-          <w:b/>
-        </w:rPr>
-        <w:t>Regulatory —</w:t>
-      </w:r>
-      <w:r>
-        <w:t xml:space="preserve"> the Korean technical file is the master dossier; each market is a reliance filing of the same device family.</w:t>
+        <w:t>One product family — the applicator device + CodeLife-configured peptide/exosome kit developed for Korean physicians — is exported as-is (personalisation by physician purpose within the same approved envelope; no per-market product development). Unit economics are identical everywhere; scenarios flex only the clinic ramp, price and utilisation.</w:t>
       </w:r>
     </w:p>
     <w:p>
@@ -147,7 +78,1373 @@
         <w:pStyle w:val="Heading2"/>
       </w:pPr>
       <w:r>
-        <w:t>Cumulative clinics by market</w:t>
+        <w:t>Scenario assumptions</w:t>
+      </w:r>
+    </w:p>
+    <w:tbl>
+      <w:tblPr>
+        <w:tblStyle w:val="LightGrid-Accent1"/>
+        <w:tblW w:type="auto" w:w="0"/>
+        <w:jc w:val="center"/>
+        <w:tblLook w:firstColumn="1" w:firstRow="1" w:lastColumn="0" w:lastRow="0" w:noHBand="0" w:noVBand="1" w:val="04A0"/>
+      </w:tblPr>
+      <w:tblGrid>
+        <w:gridCol w:w="2160"/>
+        <w:gridCol w:w="2160"/>
+        <w:gridCol w:w="2160"/>
+        <w:gridCol w:w="2160"/>
+      </w:tblGrid>
+      <w:tr>
+        <w:tc>
+          <w:tcPr>
+            <w:tcW w:type="dxa" w:w="2592"/>
+          </w:tcPr>
+          <w:p>
+            <w:r>
+              <w:rPr>
+                <w:b/>
+                <w:sz w:val="19"/>
+              </w:rPr>
+              <w:t>Lever</w:t>
+            </w:r>
+          </w:p>
+        </w:tc>
+        <w:tc>
+          <w:tcPr>
+            <w:tcW w:type="dxa" w:w="2304"/>
+          </w:tcPr>
+          <w:p>
+            <w:r>
+              <w:rPr>
+                <w:b/>
+                <w:sz w:val="19"/>
+              </w:rPr>
+              <w:t>Conservative</w:t>
+            </w:r>
+          </w:p>
+        </w:tc>
+        <w:tc>
+          <w:tcPr>
+            <w:tcW w:type="dxa" w:w="2304"/>
+          </w:tcPr>
+          <w:p>
+            <w:r>
+              <w:rPr>
+                <w:b/>
+                <w:sz w:val="19"/>
+              </w:rPr>
+              <w:t>Base</w:t>
+            </w:r>
+          </w:p>
+        </w:tc>
+        <w:tc>
+          <w:tcPr>
+            <w:tcW w:type="dxa" w:w="2160"/>
+          </w:tcPr>
+          <w:p>
+            <w:r>
+              <w:rPr>
+                <w:b/>
+                <w:sz w:val="19"/>
+              </w:rPr>
+              <w:t>Upside</w:t>
+            </w:r>
+          </w:p>
+        </w:tc>
+      </w:tr>
+      <w:tr>
+        <w:tc>
+          <w:tcPr>
+            <w:tcW w:type="dxa" w:w="2592"/>
+          </w:tcPr>
+          <w:p>
+            <w:r>
+              <w:rPr>
+                <w:sz w:val="19"/>
+              </w:rPr>
+              <w:t>Markets</w:t>
+            </w:r>
+          </w:p>
+        </w:tc>
+        <w:tc>
+          <w:tcPr>
+            <w:tcW w:type="dxa" w:w="2304"/>
+          </w:tcPr>
+          <w:p>
+            <w:r>
+              <w:rPr>
+                <w:sz w:val="19"/>
+              </w:rPr>
+              <w:t>11 (China excluded)</w:t>
+            </w:r>
+          </w:p>
+        </w:tc>
+        <w:tc>
+          <w:tcPr>
+            <w:tcW w:type="dxa" w:w="2304"/>
+          </w:tcPr>
+          <w:p>
+            <w:r>
+              <w:rPr>
+                <w:sz w:val="19"/>
+              </w:rPr>
+              <w:t>12</w:t>
+            </w:r>
+          </w:p>
+        </w:tc>
+        <w:tc>
+          <w:tcPr>
+            <w:tcW w:type="dxa" w:w="2160"/>
+          </w:tcPr>
+          <w:p>
+            <w:r>
+              <w:rPr>
+                <w:sz w:val="19"/>
+              </w:rPr>
+              <w:t>12</w:t>
+            </w:r>
+          </w:p>
+        </w:tc>
+      </w:tr>
+      <w:tr>
+        <w:tc>
+          <w:tcPr>
+            <w:tcW w:type="dxa" w:w="2592"/>
+          </w:tcPr>
+          <w:p>
+            <w:r>
+              <w:rPr>
+                <w:sz w:val="19"/>
+              </w:rPr>
+              <w:t>Clinic ramp vs base</w:t>
+            </w:r>
+          </w:p>
+        </w:tc>
+        <w:tc>
+          <w:tcPr>
+            <w:tcW w:type="dxa" w:w="2304"/>
+          </w:tcPr>
+          <w:p>
+            <w:r>
+              <w:rPr>
+                <w:sz w:val="19"/>
+              </w:rPr>
+              <w:t>0.62x</w:t>
+            </w:r>
+          </w:p>
+        </w:tc>
+        <w:tc>
+          <w:tcPr>
+            <w:tcW w:type="dxa" w:w="2304"/>
+          </w:tcPr>
+          <w:p>
+            <w:r>
+              <w:rPr>
+                <w:sz w:val="19"/>
+              </w:rPr>
+              <w:t>1.00x</w:t>
+            </w:r>
+          </w:p>
+        </w:tc>
+        <w:tc>
+          <w:tcPr>
+            <w:tcW w:type="dxa" w:w="2160"/>
+          </w:tcPr>
+          <w:p>
+            <w:r>
+              <w:rPr>
+                <w:sz w:val="19"/>
+              </w:rPr>
+              <w:t>1.30x</w:t>
+            </w:r>
+          </w:p>
+        </w:tc>
+      </w:tr>
+      <w:tr>
+        <w:tc>
+          <w:tcPr>
+            <w:tcW w:type="dxa" w:w="2592"/>
+          </w:tcPr>
+          <w:p>
+            <w:r>
+              <w:rPr>
+                <w:sz w:val="19"/>
+              </w:rPr>
+              <w:t>Kit EXW</w:t>
+            </w:r>
+          </w:p>
+        </w:tc>
+        <w:tc>
+          <w:tcPr>
+            <w:tcW w:type="dxa" w:w="2304"/>
+          </w:tcPr>
+          <w:p>
+            <w:r>
+              <w:rPr>
+                <w:sz w:val="19"/>
+              </w:rPr>
+              <w:t>$30.00</w:t>
+            </w:r>
+          </w:p>
+        </w:tc>
+        <w:tc>
+          <w:tcPr>
+            <w:tcW w:type="dxa" w:w="2304"/>
+          </w:tcPr>
+          <w:p>
+            <w:r>
+              <w:rPr>
+                <w:sz w:val="19"/>
+              </w:rPr>
+              <w:t>$32.50</w:t>
+            </w:r>
+          </w:p>
+        </w:tc>
+        <w:tc>
+          <w:tcPr>
+            <w:tcW w:type="dxa" w:w="2160"/>
+          </w:tcPr>
+          <w:p>
+            <w:r>
+              <w:rPr>
+                <w:sz w:val="19"/>
+              </w:rPr>
+              <w:t>$35.00</w:t>
+            </w:r>
+          </w:p>
+        </w:tc>
+      </w:tr>
+      <w:tr>
+        <w:tc>
+          <w:tcPr>
+            <w:tcW w:type="dxa" w:w="2592"/>
+          </w:tcPr>
+          <w:p>
+            <w:r>
+              <w:rPr>
+                <w:sz w:val="19"/>
+              </w:rPr>
+              <w:t>Kit gross margin</w:t>
+            </w:r>
+          </w:p>
+        </w:tc>
+        <w:tc>
+          <w:tcPr>
+            <w:tcW w:type="dxa" w:w="2304"/>
+          </w:tcPr>
+          <w:p>
+            <w:r>
+              <w:rPr>
+                <w:sz w:val="19"/>
+              </w:rPr>
+              <w:t>65.0%</w:t>
+            </w:r>
+          </w:p>
+        </w:tc>
+        <w:tc>
+          <w:tcPr>
+            <w:tcW w:type="dxa" w:w="2304"/>
+          </w:tcPr>
+          <w:p>
+            <w:r>
+              <w:rPr>
+                <w:sz w:val="19"/>
+              </w:rPr>
+              <w:t>66.2%</w:t>
+            </w:r>
+          </w:p>
+        </w:tc>
+        <w:tc>
+          <w:tcPr>
+            <w:tcW w:type="dxa" w:w="2160"/>
+          </w:tcPr>
+          <w:p>
+            <w:r>
+              <w:rPr>
+                <w:sz w:val="19"/>
+              </w:rPr>
+              <w:t>67.1%</w:t>
+            </w:r>
+          </w:p>
+        </w:tc>
+      </w:tr>
+      <w:tr>
+        <w:tc>
+          <w:tcPr>
+            <w:tcW w:type="dxa" w:w="2592"/>
+          </w:tcPr>
+          <w:p>
+            <w:r>
+              <w:rPr>
+                <w:sz w:val="19"/>
+              </w:rPr>
+              <w:t>Device GM</w:t>
+            </w:r>
+          </w:p>
+        </w:tc>
+        <w:tc>
+          <w:tcPr>
+            <w:tcW w:type="dxa" w:w="2304"/>
+          </w:tcPr>
+          <w:p>
+            <w:r>
+              <w:rPr>
+                <w:sz w:val="19"/>
+              </w:rPr>
+              <w:t>35%</w:t>
+            </w:r>
+          </w:p>
+        </w:tc>
+        <w:tc>
+          <w:tcPr>
+            <w:tcW w:type="dxa" w:w="2304"/>
+          </w:tcPr>
+          <w:p>
+            <w:r>
+              <w:rPr>
+                <w:sz w:val="19"/>
+              </w:rPr>
+              <w:t>40%</w:t>
+            </w:r>
+          </w:p>
+        </w:tc>
+        <w:tc>
+          <w:tcPr>
+            <w:tcW w:type="dxa" w:w="2160"/>
+          </w:tcPr>
+          <w:p>
+            <w:r>
+              <w:rPr>
+                <w:sz w:val="19"/>
+              </w:rPr>
+              <w:t>42%</w:t>
+            </w:r>
+          </w:p>
+        </w:tc>
+      </w:tr>
+      <w:tr>
+        <w:tc>
+          <w:tcPr>
+            <w:tcW w:type="dxa" w:w="2592"/>
+          </w:tcPr>
+          <w:p>
+            <w:r>
+              <w:rPr>
+                <w:sz w:val="19"/>
+              </w:rPr>
+              <w:t>Kits/clinic/yr</w:t>
+            </w:r>
+          </w:p>
+        </w:tc>
+        <w:tc>
+          <w:tcPr>
+            <w:tcW w:type="dxa" w:w="2304"/>
+          </w:tcPr>
+          <w:p>
+            <w:r>
+              <w:rPr>
+                <w:sz w:val="19"/>
+              </w:rPr>
+              <w:t>1,200</w:t>
+            </w:r>
+          </w:p>
+        </w:tc>
+        <w:tc>
+          <w:tcPr>
+            <w:tcW w:type="dxa" w:w="2304"/>
+          </w:tcPr>
+          <w:p>
+            <w:r>
+              <w:rPr>
+                <w:sz w:val="19"/>
+              </w:rPr>
+              <w:t>1,400</w:t>
+            </w:r>
+          </w:p>
+        </w:tc>
+        <w:tc>
+          <w:tcPr>
+            <w:tcW w:type="dxa" w:w="2160"/>
+          </w:tcPr>
+          <w:p>
+            <w:r>
+              <w:rPr>
+                <w:sz w:val="19"/>
+              </w:rPr>
+              <w:t>1,500</w:t>
+            </w:r>
+          </w:p>
+        </w:tc>
+      </w:tr>
+    </w:tbl>
+    <w:p>
+      <w:pPr>
+        <w:spacing w:after="40"/>
+      </w:pPr>
+    </w:p>
+    <w:p>
+      <w:pPr>
+        <w:pStyle w:val="Heading2"/>
+      </w:pPr>
+      <w:r>
+        <w:t>Scenario comparison — Total revenue ($000s)</w:t>
+      </w:r>
+    </w:p>
+    <w:tbl>
+      <w:tblPr>
+        <w:tblStyle w:val="LightGrid-Accent1"/>
+        <w:tblW w:type="auto" w:w="0"/>
+        <w:jc w:val="center"/>
+        <w:tblLook w:firstColumn="1" w:firstRow="1" w:lastColumn="0" w:lastRow="0" w:noHBand="0" w:noVBand="1" w:val="04A0"/>
+      </w:tblPr>
+      <w:tblGrid>
+        <w:gridCol w:w="1728"/>
+        <w:gridCol w:w="1728"/>
+        <w:gridCol w:w="1728"/>
+        <w:gridCol w:w="1728"/>
+        <w:gridCol w:w="1728"/>
+      </w:tblGrid>
+      <w:tr>
+        <w:tc>
+          <w:tcPr>
+            <w:tcW w:type="dxa" w:w="2592"/>
+          </w:tcPr>
+          <w:p>
+            <w:r>
+              <w:rPr>
+                <w:b/>
+                <w:sz w:val="19"/>
+              </w:rPr>
+              <w:t>Scenario</w:t>
+            </w:r>
+          </w:p>
+        </w:tc>
+        <w:tc>
+          <w:tcPr>
+            <w:tcW w:type="dxa" w:w="1584"/>
+          </w:tcPr>
+          <w:p>
+            <w:r>
+              <w:rPr>
+                <w:b/>
+                <w:sz w:val="19"/>
+              </w:rPr>
+              <w:t>2027</w:t>
+            </w:r>
+          </w:p>
+        </w:tc>
+        <w:tc>
+          <w:tcPr>
+            <w:tcW w:type="dxa" w:w="1584"/>
+          </w:tcPr>
+          <w:p>
+            <w:r>
+              <w:rPr>
+                <w:b/>
+                <w:sz w:val="19"/>
+              </w:rPr>
+              <w:t>2028</w:t>
+            </w:r>
+          </w:p>
+        </w:tc>
+        <w:tc>
+          <w:tcPr>
+            <w:tcW w:type="dxa" w:w="1584"/>
+          </w:tcPr>
+          <w:p>
+            <w:r>
+              <w:rPr>
+                <w:b/>
+                <w:sz w:val="19"/>
+              </w:rPr>
+              <w:t>2029</w:t>
+            </w:r>
+          </w:p>
+        </w:tc>
+        <w:tc>
+          <w:tcPr>
+            <w:tcW w:type="dxa" w:w="1584"/>
+          </w:tcPr>
+          <w:p>
+            <w:r>
+              <w:rPr>
+                <w:b/>
+                <w:sz w:val="19"/>
+              </w:rPr>
+              <w:t>2030</w:t>
+            </w:r>
+          </w:p>
+        </w:tc>
+      </w:tr>
+      <w:tr>
+        <w:tc>
+          <w:tcPr>
+            <w:tcW w:type="dxa" w:w="2592"/>
+          </w:tcPr>
+          <w:p>
+            <w:r>
+              <w:rPr>
+                <w:sz w:val="19"/>
+              </w:rPr>
+              <w:t>Conservative</w:t>
+            </w:r>
+          </w:p>
+        </w:tc>
+        <w:tc>
+          <w:tcPr>
+            <w:tcW w:type="dxa" w:w="1584"/>
+          </w:tcPr>
+          <w:p>
+            <w:r>
+              <w:rPr>
+                <w:sz w:val="19"/>
+              </w:rPr>
+              <w:t>2,058</w:t>
+            </w:r>
+          </w:p>
+        </w:tc>
+        <w:tc>
+          <w:tcPr>
+            <w:tcW w:type="dxa" w:w="1584"/>
+          </w:tcPr>
+          <w:p>
+            <w:r>
+              <w:rPr>
+                <w:sz w:val="19"/>
+              </w:rPr>
+              <w:t>8,148</w:t>
+            </w:r>
+          </w:p>
+        </w:tc>
+        <w:tc>
+          <w:tcPr>
+            <w:tcW w:type="dxa" w:w="1584"/>
+          </w:tcPr>
+          <w:p>
+            <w:r>
+              <w:rPr>
+                <w:sz w:val="19"/>
+              </w:rPr>
+              <w:t>19,449</w:t>
+            </w:r>
+          </w:p>
+        </w:tc>
+        <w:tc>
+          <w:tcPr>
+            <w:tcW w:type="dxa" w:w="1584"/>
+          </w:tcPr>
+          <w:p>
+            <w:r>
+              <w:rPr>
+                <w:sz w:val="19"/>
+              </w:rPr>
+              <w:t>34,992</w:t>
+            </w:r>
+          </w:p>
+        </w:tc>
+      </w:tr>
+      <w:tr>
+        <w:tc>
+          <w:tcPr>
+            <w:tcW w:type="dxa" w:w="2592"/>
+          </w:tcPr>
+          <w:p>
+            <w:r>
+              <w:rPr>
+                <w:sz w:val="19"/>
+              </w:rPr>
+              <w:t>Base</w:t>
+            </w:r>
+          </w:p>
+        </w:tc>
+        <w:tc>
+          <w:tcPr>
+            <w:tcW w:type="dxa" w:w="1584"/>
+          </w:tcPr>
+          <w:p>
+            <w:r>
+              <w:rPr>
+                <w:sz w:val="19"/>
+              </w:rPr>
+              <w:t>4,120</w:t>
+            </w:r>
+          </w:p>
+        </w:tc>
+        <w:tc>
+          <w:tcPr>
+            <w:tcW w:type="dxa" w:w="1584"/>
+          </w:tcPr>
+          <w:p>
+            <w:r>
+              <w:rPr>
+                <w:sz w:val="19"/>
+              </w:rPr>
+              <w:t>16,421</w:t>
+            </w:r>
+          </w:p>
+        </w:tc>
+        <w:tc>
+          <w:tcPr>
+            <w:tcW w:type="dxa" w:w="1584"/>
+          </w:tcPr>
+          <w:p>
+            <w:r>
+              <w:rPr>
+                <w:sz w:val="19"/>
+              </w:rPr>
+              <w:t>40,299</w:t>
+            </w:r>
+          </w:p>
+        </w:tc>
+        <w:tc>
+          <w:tcPr>
+            <w:tcW w:type="dxa" w:w="1584"/>
+          </w:tcPr>
+          <w:p>
+            <w:r>
+              <w:rPr>
+                <w:sz w:val="19"/>
+              </w:rPr>
+              <w:t>75,122</w:t>
+            </w:r>
+          </w:p>
+        </w:tc>
+      </w:tr>
+      <w:tr>
+        <w:tc>
+          <w:tcPr>
+            <w:tcW w:type="dxa" w:w="2592"/>
+          </w:tcPr>
+          <w:p>
+            <w:r>
+              <w:rPr>
+                <w:sz w:val="19"/>
+              </w:rPr>
+              <w:t>Upside</w:t>
+            </w:r>
+          </w:p>
+        </w:tc>
+        <w:tc>
+          <w:tcPr>
+            <w:tcW w:type="dxa" w:w="1584"/>
+          </w:tcPr>
+          <w:p>
+            <w:r>
+              <w:rPr>
+                <w:sz w:val="19"/>
+              </w:rPr>
+              <w:t>6,084</w:t>
+            </w:r>
+          </w:p>
+        </w:tc>
+        <w:tc>
+          <w:tcPr>
+            <w:tcW w:type="dxa" w:w="1584"/>
+          </w:tcPr>
+          <w:p>
+            <w:r>
+              <w:rPr>
+                <w:sz w:val="19"/>
+              </w:rPr>
+              <w:t>24,463</w:t>
+            </w:r>
+          </w:p>
+        </w:tc>
+        <w:tc>
+          <w:tcPr>
+            <w:tcW w:type="dxa" w:w="1584"/>
+          </w:tcPr>
+          <w:p>
+            <w:r>
+              <w:rPr>
+                <w:sz w:val="19"/>
+              </w:rPr>
+              <w:t>60,090</w:t>
+            </w:r>
+          </w:p>
+        </w:tc>
+        <w:tc>
+          <w:tcPr>
+            <w:tcW w:type="dxa" w:w="1584"/>
+          </w:tcPr>
+          <w:p>
+            <w:r>
+              <w:rPr>
+                <w:sz w:val="19"/>
+              </w:rPr>
+              <w:t>112,174</w:t>
+            </w:r>
+          </w:p>
+        </w:tc>
+      </w:tr>
+    </w:tbl>
+    <w:p>
+      <w:pPr>
+        <w:spacing w:after="40"/>
+      </w:pPr>
+    </w:p>
+    <w:p>
+      <w:pPr>
+        <w:pStyle w:val="Heading2"/>
+      </w:pPr>
+      <w:r>
+        <w:t>Scenario comparison — EBITDA ($000s)</w:t>
+      </w:r>
+    </w:p>
+    <w:tbl>
+      <w:tblPr>
+        <w:tblStyle w:val="LightGrid-Accent1"/>
+        <w:tblW w:type="auto" w:w="0"/>
+        <w:jc w:val="center"/>
+        <w:tblLook w:firstColumn="1" w:firstRow="1" w:lastColumn="0" w:lastRow="0" w:noHBand="0" w:noVBand="1" w:val="04A0"/>
+      </w:tblPr>
+      <w:tblGrid>
+        <w:gridCol w:w="1728"/>
+        <w:gridCol w:w="1728"/>
+        <w:gridCol w:w="1728"/>
+        <w:gridCol w:w="1728"/>
+        <w:gridCol w:w="1728"/>
+      </w:tblGrid>
+      <w:tr>
+        <w:tc>
+          <w:tcPr>
+            <w:tcW w:type="dxa" w:w="2592"/>
+          </w:tcPr>
+          <w:p>
+            <w:r>
+              <w:rPr>
+                <w:b/>
+                <w:sz w:val="19"/>
+              </w:rPr>
+              <w:t>Scenario</w:t>
+            </w:r>
+          </w:p>
+        </w:tc>
+        <w:tc>
+          <w:tcPr>
+            <w:tcW w:type="dxa" w:w="1584"/>
+          </w:tcPr>
+          <w:p>
+            <w:r>
+              <w:rPr>
+                <w:b/>
+                <w:sz w:val="19"/>
+              </w:rPr>
+              <w:t>2027</w:t>
+            </w:r>
+          </w:p>
+        </w:tc>
+        <w:tc>
+          <w:tcPr>
+            <w:tcW w:type="dxa" w:w="1584"/>
+          </w:tcPr>
+          <w:p>
+            <w:r>
+              <w:rPr>
+                <w:b/>
+                <w:sz w:val="19"/>
+              </w:rPr>
+              <w:t>2028</w:t>
+            </w:r>
+          </w:p>
+        </w:tc>
+        <w:tc>
+          <w:tcPr>
+            <w:tcW w:type="dxa" w:w="1584"/>
+          </w:tcPr>
+          <w:p>
+            <w:r>
+              <w:rPr>
+                <w:b/>
+                <w:sz w:val="19"/>
+              </w:rPr>
+              <w:t>2029</w:t>
+            </w:r>
+          </w:p>
+        </w:tc>
+        <w:tc>
+          <w:tcPr>
+            <w:tcW w:type="dxa" w:w="1584"/>
+          </w:tcPr>
+          <w:p>
+            <w:r>
+              <w:rPr>
+                <w:b/>
+                <w:sz w:val="19"/>
+              </w:rPr>
+              <w:t>2030</w:t>
+            </w:r>
+          </w:p>
+        </w:tc>
+      </w:tr>
+      <w:tr>
+        <w:tc>
+          <w:tcPr>
+            <w:tcW w:type="dxa" w:w="2592"/>
+          </w:tcPr>
+          <w:p>
+            <w:r>
+              <w:rPr>
+                <w:sz w:val="19"/>
+              </w:rPr>
+              <w:t>Conservative</w:t>
+            </w:r>
+          </w:p>
+        </w:tc>
+        <w:tc>
+          <w:tcPr>
+            <w:tcW w:type="dxa" w:w="1584"/>
+          </w:tcPr>
+          <w:p>
+            <w:r>
+              <w:rPr>
+                <w:sz w:val="19"/>
+              </w:rPr>
+              <w:t>-1,550</w:t>
+            </w:r>
+          </w:p>
+        </w:tc>
+        <w:tc>
+          <w:tcPr>
+            <w:tcW w:type="dxa" w:w="1584"/>
+          </w:tcPr>
+          <w:p>
+            <w:r>
+              <w:rPr>
+                <w:sz w:val="19"/>
+              </w:rPr>
+              <w:t>-902</w:t>
+            </w:r>
+          </w:p>
+        </w:tc>
+        <w:tc>
+          <w:tcPr>
+            <w:tcW w:type="dxa" w:w="1584"/>
+          </w:tcPr>
+          <w:p>
+            <w:r>
+              <w:rPr>
+                <w:sz w:val="19"/>
+              </w:rPr>
+              <w:t>3,299</w:t>
+            </w:r>
+          </w:p>
+        </w:tc>
+        <w:tc>
+          <w:tcPr>
+            <w:tcW w:type="dxa" w:w="1584"/>
+          </w:tcPr>
+          <w:p>
+            <w:r>
+              <w:rPr>
+                <w:sz w:val="19"/>
+              </w:rPr>
+              <w:t>10,324</w:t>
+            </w:r>
+          </w:p>
+        </w:tc>
+      </w:tr>
+      <w:tr>
+        <w:tc>
+          <w:tcPr>
+            <w:tcW w:type="dxa" w:w="2592"/>
+          </w:tcPr>
+          <w:p>
+            <w:r>
+              <w:rPr>
+                <w:sz w:val="19"/>
+              </w:rPr>
+              <w:t>Base</w:t>
+            </w:r>
+          </w:p>
+        </w:tc>
+        <w:tc>
+          <w:tcPr>
+            <w:tcW w:type="dxa" w:w="1584"/>
+          </w:tcPr>
+          <w:p>
+            <w:r>
+              <w:rPr>
+                <w:sz w:val="19"/>
+              </w:rPr>
+              <w:t>-400</w:t>
+            </w:r>
+          </w:p>
+        </w:tc>
+        <w:tc>
+          <w:tcPr>
+            <w:tcW w:type="dxa" w:w="1584"/>
+          </w:tcPr>
+          <w:p>
+            <w:r>
+              <w:rPr>
+                <w:sz w:val="19"/>
+              </w:rPr>
+              <w:t>3,585</w:t>
+            </w:r>
+          </w:p>
+        </w:tc>
+        <w:tc>
+          <w:tcPr>
+            <w:tcW w:type="dxa" w:w="1584"/>
+          </w:tcPr>
+          <w:p>
+            <w:r>
+              <w:rPr>
+                <w:sz w:val="19"/>
+              </w:rPr>
+              <w:t>15,145</w:t>
+            </w:r>
+          </w:p>
+        </w:tc>
+        <w:tc>
+          <w:tcPr>
+            <w:tcW w:type="dxa" w:w="1584"/>
+          </w:tcPr>
+          <w:p>
+            <w:r>
+              <w:rPr>
+                <w:sz w:val="19"/>
+              </w:rPr>
+              <w:t>33,030</w:t>
+            </w:r>
+          </w:p>
+        </w:tc>
+      </w:tr>
+      <w:tr>
+        <w:tc>
+          <w:tcPr>
+            <w:tcW w:type="dxa" w:w="2592"/>
+          </w:tcPr>
+          <w:p>
+            <w:r>
+              <w:rPr>
+                <w:sz w:val="19"/>
+              </w:rPr>
+              <w:t>Upside</w:t>
+            </w:r>
+          </w:p>
+        </w:tc>
+        <w:tc>
+          <w:tcPr>
+            <w:tcW w:type="dxa" w:w="1584"/>
+          </w:tcPr>
+          <w:p>
+            <w:r>
+              <w:rPr>
+                <w:sz w:val="19"/>
+              </w:rPr>
+              <w:t>428</w:t>
+            </w:r>
+          </w:p>
+        </w:tc>
+        <w:tc>
+          <w:tcPr>
+            <w:tcW w:type="dxa" w:w="1584"/>
+          </w:tcPr>
+          <w:p>
+            <w:r>
+              <w:rPr>
+                <w:sz w:val="19"/>
+              </w:rPr>
+              <w:t>7,576</w:t>
+            </w:r>
+          </w:p>
+        </w:tc>
+        <w:tc>
+          <w:tcPr>
+            <w:tcW w:type="dxa" w:w="1584"/>
+          </w:tcPr>
+          <w:p>
+            <w:r>
+              <w:rPr>
+                <w:sz w:val="19"/>
+              </w:rPr>
+              <w:t>26,205</w:t>
+            </w:r>
+          </w:p>
+        </w:tc>
+        <w:tc>
+          <w:tcPr>
+            <w:tcW w:type="dxa" w:w="1584"/>
+          </w:tcPr>
+          <w:p>
+            <w:r>
+              <w:rPr>
+                <w:sz w:val="19"/>
+              </w:rPr>
+              <w:t>55,483</w:t>
+            </w:r>
+          </w:p>
+        </w:tc>
+      </w:tr>
+    </w:tbl>
+    <w:p>
+      <w:pPr>
+        <w:spacing w:after="40"/>
+      </w:pPr>
+    </w:p>
+    <w:p>
+      <w:pPr>
+        <w:pStyle w:val="Heading2"/>
+      </w:pPr>
+      <w:r>
+        <w:t>2030 snapshot</w:t>
+      </w:r>
+    </w:p>
+    <w:tbl>
+      <w:tblPr>
+        <w:tblStyle w:val="LightGrid-Accent1"/>
+        <w:tblW w:type="auto" w:w="0"/>
+        <w:jc w:val="center"/>
+        <w:tblLook w:firstColumn="1" w:firstRow="1" w:lastColumn="0" w:lastRow="0" w:noHBand="0" w:noVBand="1" w:val="04A0"/>
+      </w:tblPr>
+      <w:tblGrid>
+        <w:gridCol w:w="1440"/>
+        <w:gridCol w:w="1440"/>
+        <w:gridCol w:w="1440"/>
+        <w:gridCol w:w="1440"/>
+        <w:gridCol w:w="1440"/>
+        <w:gridCol w:w="1440"/>
+      </w:tblGrid>
+      <w:tr>
+        <w:tc>
+          <w:tcPr>
+            <w:tcW w:type="dxa" w:w="2160"/>
+          </w:tcPr>
+          <w:p>
+            <w:r>
+              <w:rPr>
+                <w:b/>
+                <w:sz w:val="19"/>
+              </w:rPr>
+              <w:t>Scenario</w:t>
+            </w:r>
+          </w:p>
+        </w:tc>
+        <w:tc>
+          <w:tcPr>
+            <w:tcW w:type="dxa" w:w="1440"/>
+          </w:tcPr>
+          <w:p>
+            <w:r>
+              <w:rPr>
+                <w:b/>
+                <w:sz w:val="19"/>
+              </w:rPr>
+              <w:t>Clinics</w:t>
+            </w:r>
+          </w:p>
+        </w:tc>
+        <w:tc>
+          <w:tcPr>
+            <w:tcW w:type="dxa" w:w="1440"/>
+          </w:tcPr>
+          <w:p>
+            <w:r>
+              <w:rPr>
+                <w:b/>
+                <w:sz w:val="19"/>
+              </w:rPr>
+              <w:t>Revenue</w:t>
+            </w:r>
+          </w:p>
+        </w:tc>
+        <w:tc>
+          <w:tcPr>
+            <w:tcW w:type="dxa" w:w="1584"/>
+          </w:tcPr>
+          <w:p>
+            <w:r>
+              <w:rPr>
+                <w:b/>
+                <w:sz w:val="19"/>
+              </w:rPr>
+              <w:t>Blended GM</w:t>
+            </w:r>
+          </w:p>
+        </w:tc>
+        <w:tc>
+          <w:tcPr>
+            <w:tcW w:type="dxa" w:w="1584"/>
+          </w:tcPr>
+          <w:p>
+            <w:r>
+              <w:rPr>
+                <w:b/>
+                <w:sz w:val="19"/>
+              </w:rPr>
+              <w:t>Gross profit</w:t>
+            </w:r>
+          </w:p>
+        </w:tc>
+        <w:tc>
+          <w:tcPr>
+            <w:tcW w:type="dxa" w:w="1440"/>
+          </w:tcPr>
+          <w:p>
+            <w:r>
+              <w:rPr>
+                <w:b/>
+                <w:sz w:val="19"/>
+              </w:rPr>
+              <w:t>EBITDA</w:t>
+            </w:r>
+          </w:p>
+        </w:tc>
+      </w:tr>
+      <w:tr>
+        <w:tc>
+          <w:tcPr>
+            <w:tcW w:type="dxa" w:w="2160"/>
+          </w:tcPr>
+          <w:p>
+            <w:r>
+              <w:rPr>
+                <w:sz w:val="19"/>
+              </w:rPr>
+              <w:t>Conservative</w:t>
+            </w:r>
+          </w:p>
+        </w:tc>
+        <w:tc>
+          <w:tcPr>
+            <w:tcW w:type="dxa" w:w="1440"/>
+          </w:tcPr>
+          <w:p>
+            <w:r>
+              <w:rPr>
+                <w:sz w:val="19"/>
+              </w:rPr>
+              <w:t>1,167</w:t>
+            </w:r>
+          </w:p>
+        </w:tc>
+        <w:tc>
+          <w:tcPr>
+            <w:tcW w:type="dxa" w:w="1440"/>
+          </w:tcPr>
+          <w:p>
+            <w:r>
+              <w:rPr>
+                <w:sz w:val="19"/>
+              </w:rPr>
+              <w:t>$35.0M</w:t>
+            </w:r>
+          </w:p>
+        </w:tc>
+        <w:tc>
+          <w:tcPr>
+            <w:tcW w:type="dxa" w:w="1584"/>
+          </w:tcPr>
+          <w:p>
+            <w:r>
+              <w:rPr>
+                <w:sz w:val="19"/>
+              </w:rPr>
+              <w:t>63.8%</w:t>
+            </w:r>
+          </w:p>
+        </w:tc>
+        <w:tc>
+          <w:tcPr>
+            <w:tcW w:type="dxa" w:w="1584"/>
+          </w:tcPr>
+          <w:p>
+            <w:r>
+              <w:rPr>
+                <w:sz w:val="19"/>
+              </w:rPr>
+              <w:t>$22.3M</w:t>
+            </w:r>
+          </w:p>
+        </w:tc>
+        <w:tc>
+          <w:tcPr>
+            <w:tcW w:type="dxa" w:w="1440"/>
+          </w:tcPr>
+          <w:p>
+            <w:r>
+              <w:rPr>
+                <w:sz w:val="19"/>
+              </w:rPr>
+              <w:t>$10.3M</w:t>
+            </w:r>
+          </w:p>
+        </w:tc>
+      </w:tr>
+      <w:tr>
+        <w:tc>
+          <w:tcPr>
+            <w:tcW w:type="dxa" w:w="2160"/>
+          </w:tcPr>
+          <w:p>
+            <w:r>
+              <w:rPr>
+                <w:sz w:val="19"/>
+              </w:rPr>
+              <w:t>Base</w:t>
+            </w:r>
+          </w:p>
+        </w:tc>
+        <w:tc>
+          <w:tcPr>
+            <w:tcW w:type="dxa" w:w="1440"/>
+          </w:tcPr>
+          <w:p>
+            <w:r>
+              <w:rPr>
+                <w:sz w:val="19"/>
+              </w:rPr>
+              <w:t>2,020</w:t>
+            </w:r>
+          </w:p>
+        </w:tc>
+        <w:tc>
+          <w:tcPr>
+            <w:tcW w:type="dxa" w:w="1440"/>
+          </w:tcPr>
+          <w:p>
+            <w:r>
+              <w:rPr>
+                <w:sz w:val="19"/>
+              </w:rPr>
+              <w:t>$75.1M</w:t>
+            </w:r>
+          </w:p>
+        </w:tc>
+        <w:tc>
+          <w:tcPr>
+            <w:tcW w:type="dxa" w:w="1584"/>
+          </w:tcPr>
+          <w:p>
+            <w:r>
+              <w:rPr>
+                <w:sz w:val="19"/>
+              </w:rPr>
+              <w:t>65.3%</w:t>
+            </w:r>
+          </w:p>
+        </w:tc>
+        <w:tc>
+          <w:tcPr>
+            <w:tcW w:type="dxa" w:w="1584"/>
+          </w:tcPr>
+          <w:p>
+            <w:r>
+              <w:rPr>
+                <w:sz w:val="19"/>
+              </w:rPr>
+              <w:t>$49.0M</w:t>
+            </w:r>
+          </w:p>
+        </w:tc>
+        <w:tc>
+          <w:tcPr>
+            <w:tcW w:type="dxa" w:w="1440"/>
+          </w:tcPr>
+          <w:p>
+            <w:r>
+              <w:rPr>
+                <w:sz w:val="19"/>
+              </w:rPr>
+              <w:t>$33.0M</w:t>
+            </w:r>
+          </w:p>
+        </w:tc>
+      </w:tr>
+      <w:tr>
+        <w:tc>
+          <w:tcPr>
+            <w:tcW w:type="dxa" w:w="2160"/>
+          </w:tcPr>
+          <w:p>
+            <w:r>
+              <w:rPr>
+                <w:sz w:val="19"/>
+              </w:rPr>
+              <w:t>Upside</w:t>
+            </w:r>
+          </w:p>
+        </w:tc>
+        <w:tc>
+          <w:tcPr>
+            <w:tcW w:type="dxa" w:w="1440"/>
+          </w:tcPr>
+          <w:p>
+            <w:r>
+              <w:rPr>
+                <w:sz w:val="19"/>
+              </w:rPr>
+              <w:t>2,626</w:t>
+            </w:r>
+          </w:p>
+        </w:tc>
+        <w:tc>
+          <w:tcPr>
+            <w:tcW w:type="dxa" w:w="1440"/>
+          </w:tcPr>
+          <w:p>
+            <w:r>
+              <w:rPr>
+                <w:sz w:val="19"/>
+              </w:rPr>
+              <w:t>$112.2M</w:t>
+            </w:r>
+          </w:p>
+        </w:tc>
+        <w:tc>
+          <w:tcPr>
+            <w:tcW w:type="dxa" w:w="1584"/>
+          </w:tcPr>
+          <w:p>
+            <w:r>
+              <w:rPr>
+                <w:sz w:val="19"/>
+              </w:rPr>
+              <w:t>66.4%</w:t>
+            </w:r>
+          </w:p>
+        </w:tc>
+        <w:tc>
+          <w:tcPr>
+            <w:tcW w:type="dxa" w:w="1584"/>
+          </w:tcPr>
+          <w:p>
+            <w:r>
+              <w:rPr>
+                <w:sz w:val="19"/>
+              </w:rPr>
+              <w:t>$74.5M</w:t>
+            </w:r>
+          </w:p>
+        </w:tc>
+        <w:tc>
+          <w:tcPr>
+            <w:tcW w:type="dxa" w:w="1440"/>
+          </w:tcPr>
+          <w:p>
+            <w:r>
+              <w:rPr>
+                <w:sz w:val="19"/>
+              </w:rPr>
+              <w:t>$55.5M</w:t>
+            </w:r>
+          </w:p>
+        </w:tc>
+      </w:tr>
+    </w:tbl>
+    <w:p>
+      <w:pPr>
+        <w:spacing w:after="40"/>
+      </w:pPr>
+    </w:p>
+    <w:p>
+      <w:pPr>
+        <w:pStyle w:val="Heading2"/>
+      </w:pPr>
+      <w:r>
+        <w:t>Base case — cumulative clinics by market</w:t>
       </w:r>
     </w:p>
     <w:tbl>
@@ -1115,709 +2412,6 @@
     </w:p>
     <w:p>
       <w:pPr>
-        <w:pStyle w:val="Heading2"/>
-      </w:pPr>
-      <w:r>
-        <w:t>Consolidated P&amp;L ($000s)</w:t>
-      </w:r>
-    </w:p>
-    <w:tbl>
-      <w:tblPr>
-        <w:tblStyle w:val="LightGrid-Accent1"/>
-        <w:tblW w:type="auto" w:w="0"/>
-        <w:jc w:val="center"/>
-        <w:tblLook w:firstColumn="1" w:firstRow="1" w:lastColumn="0" w:lastRow="0" w:noHBand="0" w:noVBand="1" w:val="04A0"/>
-      </w:tblPr>
-      <w:tblGrid>
-        <w:gridCol w:w="1728"/>
-        <w:gridCol w:w="1728"/>
-        <w:gridCol w:w="1728"/>
-        <w:gridCol w:w="1728"/>
-        <w:gridCol w:w="1728"/>
-      </w:tblGrid>
-      <w:tr>
-        <w:tc>
-          <w:tcPr>
-            <w:tcW w:type="dxa" w:w="3024"/>
-          </w:tcPr>
-          <w:p>
-            <w:r>
-              <w:rPr>
-                <w:b/>
-                <w:sz w:val="19"/>
-              </w:rPr>
-              <w:t>Line</w:t>
-            </w:r>
-          </w:p>
-        </w:tc>
-        <w:tc>
-          <w:tcPr>
-            <w:tcW w:type="dxa" w:w="1584"/>
-          </w:tcPr>
-          <w:p>
-            <w:r>
-              <w:rPr>
-                <w:b/>
-                <w:sz w:val="19"/>
-              </w:rPr>
-              <w:t>2027</w:t>
-            </w:r>
-          </w:p>
-        </w:tc>
-        <w:tc>
-          <w:tcPr>
-            <w:tcW w:type="dxa" w:w="1584"/>
-          </w:tcPr>
-          <w:p>
-            <w:r>
-              <w:rPr>
-                <w:b/>
-                <w:sz w:val="19"/>
-              </w:rPr>
-              <w:t>2028</w:t>
-            </w:r>
-          </w:p>
-        </w:tc>
-        <w:tc>
-          <w:tcPr>
-            <w:tcW w:type="dxa" w:w="1584"/>
-          </w:tcPr>
-          <w:p>
-            <w:r>
-              <w:rPr>
-                <w:b/>
-                <w:sz w:val="19"/>
-              </w:rPr>
-              <w:t>2029</w:t>
-            </w:r>
-          </w:p>
-        </w:tc>
-        <w:tc>
-          <w:tcPr>
-            <w:tcW w:type="dxa" w:w="1584"/>
-          </w:tcPr>
-          <w:p>
-            <w:r>
-              <w:rPr>
-                <w:b/>
-                <w:sz w:val="19"/>
-              </w:rPr>
-              <w:t>2030</w:t>
-            </w:r>
-          </w:p>
-        </w:tc>
-      </w:tr>
-      <w:tr>
-        <w:tc>
-          <w:tcPr>
-            <w:tcW w:type="dxa" w:w="3024"/>
-          </w:tcPr>
-          <w:p>
-            <w:r>
-              <w:rPr>
-                <w:sz w:val="19"/>
-              </w:rPr>
-              <w:t>New clinics (devices sold)</w:t>
-            </w:r>
-          </w:p>
-        </w:tc>
-        <w:tc>
-          <w:tcPr>
-            <w:tcW w:type="dxa" w:w="1584"/>
-          </w:tcPr>
-          <w:p>
-            <w:r>
-              <w:rPr>
-                <w:sz w:val="19"/>
-              </w:rPr>
-              <w:t>160</w:t>
-            </w:r>
-          </w:p>
-        </w:tc>
-        <w:tc>
-          <w:tcPr>
-            <w:tcW w:type="dxa" w:w="1584"/>
-          </w:tcPr>
-          <w:p>
-            <w:r>
-              <w:rPr>
-                <w:sz w:val="19"/>
-              </w:rPr>
-              <w:t>355</w:t>
-            </w:r>
-          </w:p>
-        </w:tc>
-        <w:tc>
-          <w:tcPr>
-            <w:tcW w:type="dxa" w:w="1584"/>
-          </w:tcPr>
-          <w:p>
-            <w:r>
-              <w:rPr>
-                <w:sz w:val="19"/>
-              </w:rPr>
-              <w:t>655</w:t>
-            </w:r>
-          </w:p>
-        </w:tc>
-        <w:tc>
-          <w:tcPr>
-            <w:tcW w:type="dxa" w:w="1584"/>
-          </w:tcPr>
-          <w:p>
-            <w:r>
-              <w:rPr>
-                <w:sz w:val="19"/>
-              </w:rPr>
-              <w:t>850</w:t>
-            </w:r>
-          </w:p>
-        </w:tc>
-      </w:tr>
-      <w:tr>
-        <w:tc>
-          <w:tcPr>
-            <w:tcW w:type="dxa" w:w="3024"/>
-          </w:tcPr>
-          <w:p>
-            <w:r>
-              <w:rPr>
-                <w:sz w:val="19"/>
-              </w:rPr>
-              <w:t>Treatment kits (000s)</w:t>
-            </w:r>
-          </w:p>
-        </w:tc>
-        <w:tc>
-          <w:tcPr>
-            <w:tcW w:type="dxa" w:w="1584"/>
-          </w:tcPr>
-          <w:p>
-            <w:r>
-              <w:rPr>
-                <w:sz w:val="19"/>
-              </w:rPr>
-              <w:t>112</w:t>
-            </w:r>
-          </w:p>
-        </w:tc>
-        <w:tc>
-          <w:tcPr>
-            <w:tcW w:type="dxa" w:w="1584"/>
-          </w:tcPr>
-          <w:p>
-            <w:r>
-              <w:rPr>
-                <w:sz w:val="19"/>
-              </w:rPr>
-              <w:t>472</w:t>
-            </w:r>
-          </w:p>
-        </w:tc>
-        <w:tc>
-          <w:tcPr>
-            <w:tcW w:type="dxa" w:w="1584"/>
-          </w:tcPr>
-          <w:p>
-            <w:r>
-              <w:rPr>
-                <w:sz w:val="19"/>
-              </w:rPr>
-              <w:t>1,180</w:t>
-            </w:r>
-          </w:p>
-        </w:tc>
-        <w:tc>
-          <w:tcPr>
-            <w:tcW w:type="dxa" w:w="1584"/>
-          </w:tcPr>
-          <w:p>
-            <w:r>
-              <w:rPr>
-                <w:sz w:val="19"/>
-              </w:rPr>
-              <w:t>2,233</w:t>
-            </w:r>
-          </w:p>
-        </w:tc>
-      </w:tr>
-      <w:tr>
-        <w:tc>
-          <w:tcPr>
-            <w:tcW w:type="dxa" w:w="3024"/>
-          </w:tcPr>
-          <w:p>
-            <w:r>
-              <w:rPr>
-                <w:sz w:val="19"/>
-              </w:rPr>
-              <w:t>Kit revenue</w:t>
-            </w:r>
-          </w:p>
-        </w:tc>
-        <w:tc>
-          <w:tcPr>
-            <w:tcW w:type="dxa" w:w="1584"/>
-          </w:tcPr>
-          <w:p>
-            <w:r>
-              <w:rPr>
-                <w:sz w:val="19"/>
-              </w:rPr>
-              <w:t>3,640</w:t>
-            </w:r>
-          </w:p>
-        </w:tc>
-        <w:tc>
-          <w:tcPr>
-            <w:tcW w:type="dxa" w:w="1584"/>
-          </w:tcPr>
-          <w:p>
-            <w:r>
-              <w:rPr>
-                <w:sz w:val="19"/>
-              </w:rPr>
-              <w:t>15,356</w:t>
-            </w:r>
-          </w:p>
-        </w:tc>
-        <w:tc>
-          <w:tcPr>
-            <w:tcW w:type="dxa" w:w="1584"/>
-          </w:tcPr>
-          <w:p>
-            <w:r>
-              <w:rPr>
-                <w:sz w:val="19"/>
-              </w:rPr>
-              <w:t>38,334</w:t>
-            </w:r>
-          </w:p>
-        </w:tc>
-        <w:tc>
-          <w:tcPr>
-            <w:tcW w:type="dxa" w:w="1584"/>
-          </w:tcPr>
-          <w:p>
-            <w:r>
-              <w:rPr>
-                <w:sz w:val="19"/>
-              </w:rPr>
-              <w:t>72,572</w:t>
-            </w:r>
-          </w:p>
-        </w:tc>
-      </w:tr>
-      <w:tr>
-        <w:tc>
-          <w:tcPr>
-            <w:tcW w:type="dxa" w:w="3024"/>
-          </w:tcPr>
-          <w:p>
-            <w:r>
-              <w:rPr>
-                <w:sz w:val="19"/>
-              </w:rPr>
-              <w:t>Device revenue</w:t>
-            </w:r>
-          </w:p>
-        </w:tc>
-        <w:tc>
-          <w:tcPr>
-            <w:tcW w:type="dxa" w:w="1584"/>
-          </w:tcPr>
-          <w:p>
-            <w:r>
-              <w:rPr>
-                <w:sz w:val="19"/>
-              </w:rPr>
-              <w:t>480</w:t>
-            </w:r>
-          </w:p>
-        </w:tc>
-        <w:tc>
-          <w:tcPr>
-            <w:tcW w:type="dxa" w:w="1584"/>
-          </w:tcPr>
-          <w:p>
-            <w:r>
-              <w:rPr>
-                <w:sz w:val="19"/>
-              </w:rPr>
-              <w:t>1,065</w:t>
-            </w:r>
-          </w:p>
-        </w:tc>
-        <w:tc>
-          <w:tcPr>
-            <w:tcW w:type="dxa" w:w="1584"/>
-          </w:tcPr>
-          <w:p>
-            <w:r>
-              <w:rPr>
-                <w:sz w:val="19"/>
-              </w:rPr>
-              <w:t>1,965</w:t>
-            </w:r>
-          </w:p>
-        </w:tc>
-        <w:tc>
-          <w:tcPr>
-            <w:tcW w:type="dxa" w:w="1584"/>
-          </w:tcPr>
-          <w:p>
-            <w:r>
-              <w:rPr>
-                <w:sz w:val="19"/>
-              </w:rPr>
-              <w:t>2,550</w:t>
-            </w:r>
-          </w:p>
-        </w:tc>
-      </w:tr>
-      <w:tr>
-        <w:tc>
-          <w:tcPr>
-            <w:tcW w:type="dxa" w:w="3024"/>
-          </w:tcPr>
-          <w:p>
-            <w:r>
-              <w:rPr>
-                <w:sz w:val="19"/>
-              </w:rPr>
-              <w:t>Total revenue</w:t>
-            </w:r>
-          </w:p>
-        </w:tc>
-        <w:tc>
-          <w:tcPr>
-            <w:tcW w:type="dxa" w:w="1584"/>
-          </w:tcPr>
-          <w:p>
-            <w:r>
-              <w:rPr>
-                <w:sz w:val="19"/>
-              </w:rPr>
-              <w:t>4,120</w:t>
-            </w:r>
-          </w:p>
-        </w:tc>
-        <w:tc>
-          <w:tcPr>
-            <w:tcW w:type="dxa" w:w="1584"/>
-          </w:tcPr>
-          <w:p>
-            <w:r>
-              <w:rPr>
-                <w:sz w:val="19"/>
-              </w:rPr>
-              <w:t>16,421</w:t>
-            </w:r>
-          </w:p>
-        </w:tc>
-        <w:tc>
-          <w:tcPr>
-            <w:tcW w:type="dxa" w:w="1584"/>
-          </w:tcPr>
-          <w:p>
-            <w:r>
-              <w:rPr>
-                <w:sz w:val="19"/>
-              </w:rPr>
-              <w:t>40,299</w:t>
-            </w:r>
-          </w:p>
-        </w:tc>
-        <w:tc>
-          <w:tcPr>
-            <w:tcW w:type="dxa" w:w="1584"/>
-          </w:tcPr>
-          <w:p>
-            <w:r>
-              <w:rPr>
-                <w:sz w:val="19"/>
-              </w:rPr>
-              <w:t>75,122</w:t>
-            </w:r>
-          </w:p>
-        </w:tc>
-      </w:tr>
-      <w:tr>
-        <w:tc>
-          <w:tcPr>
-            <w:tcW w:type="dxa" w:w="3024"/>
-          </w:tcPr>
-          <w:p>
-            <w:r>
-              <w:rPr>
-                <w:sz w:val="19"/>
-              </w:rPr>
-              <w:t>Total gross profit</w:t>
-            </w:r>
-          </w:p>
-        </w:tc>
-        <w:tc>
-          <w:tcPr>
-            <w:tcW w:type="dxa" w:w="1584"/>
-          </w:tcPr>
-          <w:p>
-            <w:r>
-              <w:rPr>
-                <w:sz w:val="19"/>
-              </w:rPr>
-              <w:t>2,602</w:t>
-            </w:r>
-          </w:p>
-        </w:tc>
-        <w:tc>
-          <w:tcPr>
-            <w:tcW w:type="dxa" w:w="1584"/>
-          </w:tcPr>
-          <w:p>
-            <w:r>
-              <w:rPr>
-                <w:sz w:val="19"/>
-              </w:rPr>
-              <w:t>10,592</w:t>
-            </w:r>
-          </w:p>
-        </w:tc>
-        <w:tc>
-          <w:tcPr>
-            <w:tcW w:type="dxa" w:w="1584"/>
-          </w:tcPr>
-          <w:p>
-            <w:r>
-              <w:rPr>
-                <w:sz w:val="19"/>
-              </w:rPr>
-              <w:t>26,163</w:t>
-            </w:r>
-          </w:p>
-        </w:tc>
-        <w:tc>
-          <w:tcPr>
-            <w:tcW w:type="dxa" w:w="1584"/>
-          </w:tcPr>
-          <w:p>
-            <w:r>
-              <w:rPr>
-                <w:sz w:val="19"/>
-              </w:rPr>
-              <w:t>49,063</w:t>
-            </w:r>
-          </w:p>
-        </w:tc>
-      </w:tr>
-      <w:tr>
-        <w:tc>
-          <w:tcPr>
-            <w:tcW w:type="dxa" w:w="3024"/>
-          </w:tcPr>
-          <w:p>
-            <w:r>
-              <w:rPr>
-                <w:sz w:val="19"/>
-              </w:rPr>
-              <w:t>Blended gross margin</w:t>
-            </w:r>
-          </w:p>
-        </w:tc>
-        <w:tc>
-          <w:tcPr>
-            <w:tcW w:type="dxa" w:w="1584"/>
-          </w:tcPr>
-          <w:p>
-            <w:r>
-              <w:rPr>
-                <w:sz w:val="19"/>
-              </w:rPr>
-              <w:t>63.1%</w:t>
-            </w:r>
-          </w:p>
-        </w:tc>
-        <w:tc>
-          <w:tcPr>
-            <w:tcW w:type="dxa" w:w="1584"/>
-          </w:tcPr>
-          <w:p>
-            <w:r>
-              <w:rPr>
-                <w:sz w:val="19"/>
-              </w:rPr>
-              <w:t>64.5%</w:t>
-            </w:r>
-          </w:p>
-        </w:tc>
-        <w:tc>
-          <w:tcPr>
-            <w:tcW w:type="dxa" w:w="1584"/>
-          </w:tcPr>
-          <w:p>
-            <w:r>
-              <w:rPr>
-                <w:sz w:val="19"/>
-              </w:rPr>
-              <w:t>64.9%</w:t>
-            </w:r>
-          </w:p>
-        </w:tc>
-        <w:tc>
-          <w:tcPr>
-            <w:tcW w:type="dxa" w:w="1584"/>
-          </w:tcPr>
-          <w:p>
-            <w:r>
-              <w:rPr>
-                <w:sz w:val="19"/>
-              </w:rPr>
-              <w:t>65.3%</w:t>
-            </w:r>
-          </w:p>
-        </w:tc>
-      </w:tr>
-      <w:tr>
-        <w:tc>
-          <w:tcPr>
-            <w:tcW w:type="dxa" w:w="3024"/>
-          </w:tcPr>
-          <w:p>
-            <w:r>
-              <w:rPr>
-                <w:sz w:val="19"/>
-              </w:rPr>
-              <w:t>OpEx [ASSUMPTION]</w:t>
-            </w:r>
-          </w:p>
-        </w:tc>
-        <w:tc>
-          <w:tcPr>
-            <w:tcW w:type="dxa" w:w="1584"/>
-          </w:tcPr>
-          <w:p>
-            <w:r>
-              <w:rPr>
-                <w:sz w:val="19"/>
-              </w:rPr>
-              <w:t>3,000</w:t>
-            </w:r>
-          </w:p>
-        </w:tc>
-        <w:tc>
-          <w:tcPr>
-            <w:tcW w:type="dxa" w:w="1584"/>
-          </w:tcPr>
-          <w:p>
-            <w:r>
-              <w:rPr>
-                <w:sz w:val="19"/>
-              </w:rPr>
-              <w:t>7,000</w:t>
-            </w:r>
-          </w:p>
-        </w:tc>
-        <w:tc>
-          <w:tcPr>
-            <w:tcW w:type="dxa" w:w="1584"/>
-          </w:tcPr>
-          <w:p>
-            <w:r>
-              <w:rPr>
-                <w:sz w:val="19"/>
-              </w:rPr>
-              <w:t>11,000</w:t>
-            </w:r>
-          </w:p>
-        </w:tc>
-        <w:tc>
-          <w:tcPr>
-            <w:tcW w:type="dxa" w:w="1584"/>
-          </w:tcPr>
-          <w:p>
-            <w:r>
-              <w:rPr>
-                <w:sz w:val="19"/>
-              </w:rPr>
-              <w:t>16,000</w:t>
-            </w:r>
-          </w:p>
-        </w:tc>
-      </w:tr>
-      <w:tr>
-        <w:tc>
-          <w:tcPr>
-            <w:tcW w:type="dxa" w:w="3024"/>
-          </w:tcPr>
-          <w:p>
-            <w:r>
-              <w:rPr>
-                <w:sz w:val="19"/>
-              </w:rPr>
-              <w:t>EBITDA</w:t>
-            </w:r>
-          </w:p>
-        </w:tc>
-        <w:tc>
-          <w:tcPr>
-            <w:tcW w:type="dxa" w:w="1584"/>
-          </w:tcPr>
-          <w:p>
-            <w:r>
-              <w:rPr>
-                <w:sz w:val="19"/>
-              </w:rPr>
-              <w:t>-398</w:t>
-            </w:r>
-          </w:p>
-        </w:tc>
-        <w:tc>
-          <w:tcPr>
-            <w:tcW w:type="dxa" w:w="1584"/>
-          </w:tcPr>
-          <w:p>
-            <w:r>
-              <w:rPr>
-                <w:sz w:val="19"/>
-              </w:rPr>
-              <w:t>3,592</w:t>
-            </w:r>
-          </w:p>
-        </w:tc>
-        <w:tc>
-          <w:tcPr>
-            <w:tcW w:type="dxa" w:w="1584"/>
-          </w:tcPr>
-          <w:p>
-            <w:r>
-              <w:rPr>
-                <w:sz w:val="19"/>
-              </w:rPr>
-              <w:t>15,163</w:t>
-            </w:r>
-          </w:p>
-        </w:tc>
-        <w:tc>
-          <w:tcPr>
-            <w:tcW w:type="dxa" w:w="1584"/>
-          </w:tcPr>
-          <w:p>
-            <w:r>
-              <w:rPr>
-                <w:sz w:val="19"/>
-              </w:rPr>
-              <w:t>33,063</w:t>
-            </w:r>
-          </w:p>
-        </w:tc>
-      </w:tr>
-    </w:tbl>
-    <w:p>
-      <w:pPr>
-        <w:spacing w:after="40"/>
-      </w:pPr>
-    </w:p>
-    <w:p>
-      <w:pPr>
         <w:spacing w:after="120"/>
       </w:pPr>
       <w:r>
@@ -1827,42 +2421,7 @@
           <w:color w:val="555555"/>
           <w:sz w:val="18"/>
         </w:rPr>
-        <w:t>Kits = average active clinics × 1400 kits/clinic/yr (first-year clinics ramp, approximated by averaging opening/closing counts). Devices = new clinics × $3000. Distributors are arm's-length, non-consolidated; revenue is booked at the ex-factory line.</w:t>
-      </w:r>
-    </w:p>
-    <w:p>
-      <w:pPr>
-        <w:pStyle w:val="Heading2"/>
-      </w:pPr>
-      <w:r>
-        <w:t>Vs. the single-market (Korea-only) base</w:t>
-      </w:r>
-    </w:p>
-    <w:p>
-      <w:pPr>
-        <w:spacing w:after="120"/>
-      </w:pPr>
-      <w:r>
-        <w:rPr>
-          <w:b w:val="0"/>
-          <w:i w:val="0"/>
-          <w:sz w:val="21"/>
-        </w:rPr>
-        <w:t>The Korea-only v0.4 base reached ~$39.9M revenue by 2030 from ~1,000 clinics. Selling the SAME product into 12 markets lifts the clinic base to ~2020 and revenue to ~$75.1M by 2030 — uplift from distribution reach, not new products, so margins are unchanged and R&amp;D is not duplicated.</w:t>
-      </w:r>
-    </w:p>
-    <w:p>
-      <w:pPr>
-        <w:spacing w:after="120"/>
-      </w:pPr>
-      <w:r>
-        <w:rPr>
-          <w:b w:val="0"/>
-          <w:i/>
-          <w:color w:val="555555"/>
-          <w:sz w:val="18"/>
-        </w:rPr>
-        <w:t>Caveats: per-market clinic ramps are assumptions pending anchor-clinic evidence; the kit's regulatory class varies by market (cosmetic/device/drug) and exosome claims are restricted (see Export Strategy and business-plan §9). Cold-chain/stability must be solved on the single product spec before Wave 1.</w:t>
+        <w:t>Read-through: the Conservative case (China excluded, slower ramp, lower price) lands near the Korea-only base (~$35M vs $39.9M/2030) but across 11 markets (less single-country risk); Base ~doubles it; Upside roughly triples it — all on the same product, so the swing is distribution reach, not R&amp;D. Per-market ramps are assumptions pending anchor-clinic evidence; kit regulatory class varies by market; cold-chain must be solved on the single product spec before Wave 1.</w:t>
       </w:r>
     </w:p>
     <w:sectPr>

</xml_diff>